<commit_message>
Team 4: fix: minor edits, looks great!
</commit_message>
<xml_diff>
--- a/03_Team_Work/Team4/Milestone_3_Components/Team_Editor_Review/KU_M3_Team4_ProfileManagerEI_v05.docx
+++ b/03_Team_Work/Team4/Milestone_3_Components/Team_Editor_Review/KU_M3_Team4_ProfileManagerEI_v05.docx
@@ -4,6 +4,7 @@
   <w:body>
     <w:p>
       <w:pPr>
+        <w:keepNext/>
         <w:spacing w:before="240" w:after="80"/>
         <w:outlineLvl w:val="2"/>
         <w:rPr>
@@ -37,6 +38,7 @@
     </w:p>
     <w:p>
       <w:pPr>
+        <w:keepNext/>
         <w:spacing w:before="240" w:after="80"/>
         <w:outlineLvl w:val="2"/>
         <w:rPr>
@@ -73,16 +75,17 @@
     <w:tbl>
       <w:tblPr>
         <w:tblStyle w:val="TableGrid"/>
-        <w:tblW w:w="0" w:type="auto"/>
+        <w:tblW w:w="0" w:type="dxa"/>
+        <w:tblLayout w:type="fixed"/>
         <w:tblLook w:val="04A0" w:firstRow="1" w:lastRow="0" w:firstColumn="1" w:lastColumn="0" w:noHBand="0" w:noVBand="1"/>
       </w:tblPr>
       <w:tblGrid>
-        <w:gridCol w:w="990"/>
-        <w:gridCol w:w="2846"/>
-        <w:gridCol w:w="894"/>
-        <w:gridCol w:w="1432"/>
-        <w:gridCol w:w="845"/>
-        <w:gridCol w:w="2343"/>
+        <w:gridCol w:w="1121"/>
+        <w:gridCol w:w="2204"/>
+        <w:gridCol w:w="1007"/>
+        <w:gridCol w:w="2053"/>
+        <w:gridCol w:w="866"/>
+        <w:gridCol w:w="2104"/>
       </w:tblGrid>
       <w:tr>
         <w:trPr>
@@ -92,9 +95,9 @@
         </w:trPr>
         <w:tc>
           <w:tcPr>
-            <w:tcW w:w="990" w:type="dxa"/>
+            <w:tcW w:w="1121" w:type="dxa"/>
             <w:tcBorders>
-              <w:right w:val="single" w:sz="4" w:space="0" w:color="FFFFFF"/>
+              <w:right w:val="single" w:sz="4" w:space="0" w:color="FFFFFF" w:themeColor="background1"/>
             </w:tcBorders>
             <w:shd w:val="clear" w:color="auto" w:fill="000000" w:themeFill="text1"/>
             <w:textDirection w:val="tbRl"/>
@@ -123,10 +126,10 @@
         </w:tc>
         <w:tc>
           <w:tcPr>
-            <w:tcW w:w="2846" w:type="dxa"/>
+            <w:tcW w:w="2204" w:type="dxa"/>
             <w:tcBorders>
-              <w:left w:val="single" w:sz="4" w:space="0" w:color="FFFFFF"/>
-              <w:right w:val="single" w:sz="4" w:space="0" w:color="FFFFFF"/>
+              <w:left w:val="single" w:sz="4" w:space="0" w:color="FFFFFF" w:themeColor="background1"/>
+              <w:right w:val="single" w:sz="4" w:space="0" w:color="FFFFFF" w:themeColor="background1"/>
             </w:tcBorders>
             <w:shd w:val="clear" w:color="auto" w:fill="000000" w:themeFill="text1"/>
             <w:textDirection w:val="tbRl"/>
@@ -155,10 +158,10 @@
         </w:tc>
         <w:tc>
           <w:tcPr>
-            <w:tcW w:w="894" w:type="dxa"/>
+            <w:tcW w:w="1007" w:type="dxa"/>
             <w:tcBorders>
-              <w:left w:val="single" w:sz="4" w:space="0" w:color="FFFFFF"/>
-              <w:right w:val="single" w:sz="4" w:space="0" w:color="FFFFFF"/>
+              <w:left w:val="single" w:sz="4" w:space="0" w:color="FFFFFF" w:themeColor="background1"/>
+              <w:right w:val="single" w:sz="4" w:space="0" w:color="FFFFFF" w:themeColor="background1"/>
             </w:tcBorders>
             <w:shd w:val="clear" w:color="auto" w:fill="000000" w:themeFill="text1"/>
             <w:textDirection w:val="tbRl"/>
@@ -187,10 +190,10 @@
         </w:tc>
         <w:tc>
           <w:tcPr>
-            <w:tcW w:w="1432" w:type="dxa"/>
+            <w:tcW w:w="2053" w:type="dxa"/>
             <w:tcBorders>
-              <w:left w:val="single" w:sz="4" w:space="0" w:color="FFFFFF"/>
-              <w:right w:val="single" w:sz="4" w:space="0" w:color="FFFFFF"/>
+              <w:left w:val="single" w:sz="4" w:space="0" w:color="FFFFFF" w:themeColor="background1"/>
+              <w:right w:val="single" w:sz="4" w:space="0" w:color="FFFFFF" w:themeColor="background1"/>
             </w:tcBorders>
             <w:shd w:val="clear" w:color="auto" w:fill="000000" w:themeFill="text1"/>
             <w:textDirection w:val="tbRl"/>
@@ -213,16 +216,34 @@
                 <w:bCs/>
                 <w:color w:val="FFFFFF" w:themeColor="background1"/>
               </w:rPr>
-              <w:t>Description/ Purpose</w:t>
-            </w:r>
-          </w:p>
-        </w:tc>
-        <w:tc>
-          <w:tcPr>
-            <w:tcW w:w="845" w:type="dxa"/>
+              <w:t>Description</w:t>
+            </w:r>
+            <w:r>
+              <w:rPr>
+                <w:rFonts w:ascii="Arial" w:hAnsi="Arial" w:cs="Arial"/>
+                <w:b/>
+                <w:bCs/>
+                <w:color w:val="FFFFFF" w:themeColor="background1"/>
+              </w:rPr>
+              <w:t xml:space="preserve"> </w:t>
+            </w:r>
+            <w:r>
+              <w:rPr>
+                <w:rFonts w:ascii="Arial" w:hAnsi="Arial" w:cs="Arial"/>
+                <w:b/>
+                <w:bCs/>
+                <w:color w:val="FFFFFF" w:themeColor="background1"/>
+              </w:rPr>
+              <w:t>/ Purpose</w:t>
+            </w:r>
+          </w:p>
+        </w:tc>
+        <w:tc>
+          <w:tcPr>
+            <w:tcW w:w="866" w:type="dxa"/>
             <w:tcBorders>
-              <w:left w:val="single" w:sz="4" w:space="0" w:color="FFFFFF"/>
-              <w:right w:val="single" w:sz="4" w:space="0" w:color="FFFFFF"/>
+              <w:left w:val="single" w:sz="4" w:space="0" w:color="FFFFFF" w:themeColor="background1"/>
+              <w:right w:val="single" w:sz="4" w:space="0" w:color="FFFFFF" w:themeColor="background1"/>
             </w:tcBorders>
             <w:shd w:val="clear" w:color="auto" w:fill="000000" w:themeFill="text1"/>
             <w:textDirection w:val="tbRl"/>
@@ -245,15 +266,42 @@
                 <w:bCs/>
                 <w:color w:val="FFFFFF" w:themeColor="background1"/>
               </w:rPr>
-              <w:t>Related Requirements</w:t>
-            </w:r>
-          </w:p>
-        </w:tc>
-        <w:tc>
-          <w:tcPr>
-            <w:tcW w:w="2343" w:type="dxa"/>
+              <w:t>Related Requirement</w:t>
+            </w:r>
+            <w:r>
+              <w:rPr>
+                <w:rFonts w:ascii="Arial" w:hAnsi="Arial" w:cs="Arial"/>
+                <w:b/>
+                <w:bCs/>
+                <w:color w:val="FFFFFF" w:themeColor="background1"/>
+              </w:rPr>
+              <w:t>(</w:t>
+            </w:r>
+            <w:r>
+              <w:rPr>
+                <w:rFonts w:ascii="Arial" w:hAnsi="Arial" w:cs="Arial"/>
+                <w:b/>
+                <w:bCs/>
+                <w:color w:val="FFFFFF" w:themeColor="background1"/>
+              </w:rPr>
+              <w:t>s</w:t>
+            </w:r>
+            <w:r>
+              <w:rPr>
+                <w:rFonts w:ascii="Arial" w:hAnsi="Arial" w:cs="Arial"/>
+                <w:b/>
+                <w:bCs/>
+                <w:color w:val="FFFFFF" w:themeColor="background1"/>
+              </w:rPr>
+              <w:t>)</w:t>
+            </w:r>
+          </w:p>
+        </w:tc>
+        <w:tc>
+          <w:tcPr>
+            <w:tcW w:w="2104" w:type="dxa"/>
             <w:tcBorders>
-              <w:left w:val="single" w:sz="4" w:space="0" w:color="FFFFFF"/>
+              <w:left w:val="single" w:sz="4" w:space="0" w:color="FFFFFF" w:themeColor="background1"/>
             </w:tcBorders>
             <w:shd w:val="clear" w:color="auto" w:fill="000000" w:themeFill="text1"/>
             <w:textDirection w:val="tbRl"/>
@@ -276,7 +324,45 @@
                 <w:bCs/>
                 <w:color w:val="FFFFFF" w:themeColor="background1"/>
               </w:rPr>
-              <w:t>Collaborators/ Related Entities</w:t>
+              <w:t>Collaborators</w:t>
+            </w:r>
+            <w:r>
+              <w:rPr>
+                <w:rFonts w:ascii="Arial" w:hAnsi="Arial" w:cs="Arial"/>
+                <w:b/>
+                <w:bCs/>
+                <w:color w:val="FFFFFF" w:themeColor="background1"/>
+              </w:rPr>
+              <w:t xml:space="preserve"> </w:t>
+            </w:r>
+            <w:r>
+              <w:rPr>
+                <w:rFonts w:ascii="Arial" w:hAnsi="Arial" w:cs="Arial"/>
+                <w:b/>
+                <w:bCs/>
+                <w:color w:val="FFFFFF" w:themeColor="background1"/>
+              </w:rPr>
+              <w:t>/ Related</w:t>
+            </w:r>
+          </w:p>
+          <w:p>
+            <w:pPr>
+              <w:ind w:left="113" w:right="113"/>
+              <w:rPr>
+                <w:rFonts w:ascii="Arial" w:hAnsi="Arial" w:cs="Arial"/>
+                <w:b/>
+                <w:bCs/>
+                <w:color w:val="FFFFFF" w:themeColor="background1"/>
+              </w:rPr>
+            </w:pPr>
+            <w:r>
+              <w:rPr>
+                <w:rFonts w:ascii="Arial" w:hAnsi="Arial" w:cs="Arial"/>
+                <w:b/>
+                <w:bCs/>
+                <w:color w:val="FFFFFF" w:themeColor="background1"/>
+              </w:rPr>
+              <w:t>Entities</w:t>
             </w:r>
           </w:p>
         </w:tc>
@@ -288,8 +374,8 @@
         </w:trPr>
         <w:tc>
           <w:tcPr>
-            <w:tcW w:w="990" w:type="dxa"/>
-            <w:shd w:val="clear" w:color="auto" w:fill="D9D9D9" w:themeFill="background1" w:themeFillShade="D9"/>
+            <w:tcW w:w="1121" w:type="dxa"/>
+            <w:shd w:val="clear" w:color="auto" w:fill="CCCCCC"/>
           </w:tcPr>
           <w:p>
             <w:pPr>
@@ -337,8 +423,8 @@
         </w:tc>
         <w:tc>
           <w:tcPr>
-            <w:tcW w:w="2846" w:type="dxa"/>
-            <w:shd w:val="clear" w:color="auto" w:fill="D9D9D9" w:themeFill="background1" w:themeFillShade="D9"/>
+            <w:tcW w:w="2204" w:type="dxa"/>
+            <w:shd w:val="clear" w:color="auto" w:fill="CCCCCC"/>
           </w:tcPr>
           <w:p>
             <w:pPr>
@@ -365,8 +451,8 @@
         </w:tc>
         <w:tc>
           <w:tcPr>
-            <w:tcW w:w="894" w:type="dxa"/>
-            <w:shd w:val="clear" w:color="auto" w:fill="D9D9D9" w:themeFill="background1" w:themeFillShade="D9"/>
+            <w:tcW w:w="1007" w:type="dxa"/>
+            <w:shd w:val="clear" w:color="auto" w:fill="CCCCCC"/>
           </w:tcPr>
           <w:p>
             <w:pPr>
@@ -391,8 +477,8 @@
         </w:tc>
         <w:tc>
           <w:tcPr>
-            <w:tcW w:w="1432" w:type="dxa"/>
-            <w:shd w:val="clear" w:color="auto" w:fill="D9D9D9" w:themeFill="background1" w:themeFillShade="D9"/>
+            <w:tcW w:w="2053" w:type="dxa"/>
+            <w:shd w:val="clear" w:color="auto" w:fill="CCCCCC"/>
           </w:tcPr>
           <w:p>
             <w:pPr>
@@ -417,8 +503,8 @@
         </w:tc>
         <w:tc>
           <w:tcPr>
-            <w:tcW w:w="845" w:type="dxa"/>
-            <w:shd w:val="clear" w:color="auto" w:fill="D9D9D9" w:themeFill="background1" w:themeFillShade="D9"/>
+            <w:tcW w:w="866" w:type="dxa"/>
+            <w:shd w:val="clear" w:color="auto" w:fill="CCCCCC"/>
           </w:tcPr>
           <w:p>
             <w:pPr>
@@ -443,8 +529,8 @@
         </w:tc>
         <w:tc>
           <w:tcPr>
-            <w:tcW w:w="2343" w:type="dxa"/>
-            <w:shd w:val="clear" w:color="auto" w:fill="D9D9D9" w:themeFill="background1" w:themeFillShade="D9"/>
+            <w:tcW w:w="2104" w:type="dxa"/>
+            <w:shd w:val="clear" w:color="auto" w:fill="CCCCCC"/>
           </w:tcPr>
           <w:p>
             <w:pPr>
@@ -466,6 +552,7 @@
               <w:t xml:space="preserve">Accolades, </w:t>
             </w:r>
             <w:proofErr w:type="spellStart"/>
+            <w:proofErr w:type="gramStart"/>
             <w:r>
               <w:rPr>
                 <w:rFonts w:ascii="Arial" w:hAnsi="Arial" w:cs="Arial"/>
@@ -481,7 +568,16 @@
                 <w:sz w:val="22"/>
                 <w:szCs w:val="22"/>
               </w:rPr>
-              <w:t>()</w:t>
+              <w:t>(</w:t>
+            </w:r>
+            <w:proofErr w:type="gramEnd"/>
+            <w:r>
+              <w:rPr>
+                <w:rFonts w:ascii="Arial" w:hAnsi="Arial" w:cs="Arial"/>
+                <w:sz w:val="22"/>
+                <w:szCs w:val="22"/>
+              </w:rPr>
+              <w:t>)</w:t>
             </w:r>
           </w:p>
         </w:tc>
@@ -493,7 +589,7 @@
         </w:trPr>
         <w:tc>
           <w:tcPr>
-            <w:tcW w:w="990" w:type="dxa"/>
+            <w:tcW w:w="1121" w:type="dxa"/>
             <w:shd w:val="clear" w:color="auto" w:fill="FFFFFF" w:themeFill="background1"/>
           </w:tcPr>
           <w:p>
@@ -520,7 +616,7 @@
         </w:tc>
         <w:tc>
           <w:tcPr>
-            <w:tcW w:w="2846" w:type="dxa"/>
+            <w:tcW w:w="2204" w:type="dxa"/>
             <w:shd w:val="clear" w:color="auto" w:fill="FFFFFF" w:themeFill="background1"/>
           </w:tcPr>
           <w:p>
@@ -543,7 +639,7 @@
         </w:tc>
         <w:tc>
           <w:tcPr>
-            <w:tcW w:w="894" w:type="dxa"/>
+            <w:tcW w:w="1007" w:type="dxa"/>
             <w:shd w:val="clear" w:color="auto" w:fill="FFFFFF" w:themeFill="background1"/>
           </w:tcPr>
           <w:p>
@@ -566,7 +662,7 @@
         </w:tc>
         <w:tc>
           <w:tcPr>
-            <w:tcW w:w="1432" w:type="dxa"/>
+            <w:tcW w:w="2053" w:type="dxa"/>
             <w:shd w:val="clear" w:color="auto" w:fill="FFFFFF" w:themeFill="background1"/>
           </w:tcPr>
           <w:p>
@@ -589,7 +685,7 @@
         </w:tc>
         <w:tc>
           <w:tcPr>
-            <w:tcW w:w="845" w:type="dxa"/>
+            <w:tcW w:w="866" w:type="dxa"/>
             <w:shd w:val="clear" w:color="auto" w:fill="FFFFFF" w:themeFill="background1"/>
           </w:tcPr>
           <w:p>
@@ -629,7 +725,7 @@
         </w:tc>
         <w:tc>
           <w:tcPr>
-            <w:tcW w:w="2343" w:type="dxa"/>
+            <w:tcW w:w="2104" w:type="dxa"/>
             <w:shd w:val="clear" w:color="auto" w:fill="FFFFFF" w:themeFill="background1"/>
           </w:tcPr>
           <w:p>
@@ -660,8 +756,8 @@
         </w:trPr>
         <w:tc>
           <w:tcPr>
-            <w:tcW w:w="990" w:type="dxa"/>
-            <w:shd w:val="clear" w:color="auto" w:fill="D9D9D9" w:themeFill="background1" w:themeFillShade="D9"/>
+            <w:tcW w:w="1121" w:type="dxa"/>
+            <w:shd w:val="clear" w:color="auto" w:fill="CCCCCC"/>
           </w:tcPr>
           <w:p>
             <w:pPr>
@@ -687,8 +783,8 @@
         </w:tc>
         <w:tc>
           <w:tcPr>
-            <w:tcW w:w="2846" w:type="dxa"/>
-            <w:shd w:val="clear" w:color="auto" w:fill="D9D9D9" w:themeFill="background1" w:themeFillShade="D9"/>
+            <w:tcW w:w="2204" w:type="dxa"/>
+            <w:shd w:val="clear" w:color="auto" w:fill="CCCCCC"/>
           </w:tcPr>
           <w:p>
             <w:pPr>
@@ -699,6 +795,7 @@
               </w:rPr>
             </w:pPr>
             <w:proofErr w:type="spellStart"/>
+            <w:proofErr w:type="gramStart"/>
             <w:r>
               <w:rPr>
                 <w:rFonts w:ascii="Arial" w:hAnsi="Arial" w:cs="Arial"/>
@@ -714,14 +811,23 @@
                 <w:sz w:val="22"/>
                 <w:szCs w:val="22"/>
               </w:rPr>
-              <w:t>()</w:t>
-            </w:r>
-          </w:p>
-        </w:tc>
-        <w:tc>
-          <w:tcPr>
-            <w:tcW w:w="894" w:type="dxa"/>
-            <w:shd w:val="clear" w:color="auto" w:fill="D9D9D9" w:themeFill="background1" w:themeFillShade="D9"/>
+              <w:t>(</w:t>
+            </w:r>
+            <w:proofErr w:type="gramEnd"/>
+            <w:r>
+              <w:rPr>
+                <w:rFonts w:ascii="Arial" w:hAnsi="Arial" w:cs="Arial"/>
+                <w:sz w:val="22"/>
+                <w:szCs w:val="22"/>
+              </w:rPr>
+              <w:t>)</w:t>
+            </w:r>
+          </w:p>
+        </w:tc>
+        <w:tc>
+          <w:tcPr>
+            <w:tcW w:w="1007" w:type="dxa"/>
+            <w:shd w:val="clear" w:color="auto" w:fill="CCCCCC"/>
           </w:tcPr>
           <w:p>
             <w:pPr>
@@ -743,8 +849,8 @@
         </w:tc>
         <w:tc>
           <w:tcPr>
-            <w:tcW w:w="1432" w:type="dxa"/>
-            <w:shd w:val="clear" w:color="auto" w:fill="D9D9D9" w:themeFill="background1" w:themeFillShade="D9"/>
+            <w:tcW w:w="2053" w:type="dxa"/>
+            <w:shd w:val="clear" w:color="auto" w:fill="CCCCCC"/>
           </w:tcPr>
           <w:p>
             <w:pPr>
@@ -766,8 +872,8 @@
         </w:tc>
         <w:tc>
           <w:tcPr>
-            <w:tcW w:w="845" w:type="dxa"/>
-            <w:shd w:val="clear" w:color="auto" w:fill="D9D9D9" w:themeFill="background1" w:themeFillShade="D9"/>
+            <w:tcW w:w="866" w:type="dxa"/>
+            <w:shd w:val="clear" w:color="auto" w:fill="CCCCCC"/>
           </w:tcPr>
           <w:p>
             <w:pPr>
@@ -806,8 +912,8 @@
         </w:tc>
         <w:tc>
           <w:tcPr>
-            <w:tcW w:w="2343" w:type="dxa"/>
-            <w:shd w:val="clear" w:color="auto" w:fill="D9D9D9" w:themeFill="background1" w:themeFillShade="D9"/>
+            <w:tcW w:w="2104" w:type="dxa"/>
+            <w:shd w:val="clear" w:color="auto" w:fill="CCCCCC"/>
           </w:tcPr>
           <w:p>
             <w:pPr>
@@ -837,7 +943,7 @@
         </w:trPr>
         <w:tc>
           <w:tcPr>
-            <w:tcW w:w="990" w:type="dxa"/>
+            <w:tcW w:w="1121" w:type="dxa"/>
             <w:shd w:val="clear" w:color="auto" w:fill="FFFFFF" w:themeFill="background1"/>
           </w:tcPr>
           <w:p>
@@ -864,7 +970,7 @@
         </w:tc>
         <w:tc>
           <w:tcPr>
-            <w:tcW w:w="2846" w:type="dxa"/>
+            <w:tcW w:w="2204" w:type="dxa"/>
             <w:shd w:val="clear" w:color="auto" w:fill="FFFFFF" w:themeFill="background1"/>
           </w:tcPr>
           <w:p>
@@ -876,6 +982,7 @@
               </w:rPr>
             </w:pPr>
             <w:proofErr w:type="spellStart"/>
+            <w:proofErr w:type="gramStart"/>
             <w:r>
               <w:rPr>
                 <w:rFonts w:ascii="Arial" w:hAnsi="Arial" w:cs="Arial"/>
@@ -891,13 +998,22 @@
                 <w:sz w:val="22"/>
                 <w:szCs w:val="22"/>
               </w:rPr>
-              <w:t>()</w:t>
-            </w:r>
-          </w:p>
-        </w:tc>
-        <w:tc>
-          <w:tcPr>
-            <w:tcW w:w="894" w:type="dxa"/>
+              <w:t>(</w:t>
+            </w:r>
+            <w:proofErr w:type="gramEnd"/>
+            <w:r>
+              <w:rPr>
+                <w:rFonts w:ascii="Arial" w:hAnsi="Arial" w:cs="Arial"/>
+                <w:sz w:val="22"/>
+                <w:szCs w:val="22"/>
+              </w:rPr>
+              <w:t>)</w:t>
+            </w:r>
+          </w:p>
+        </w:tc>
+        <w:tc>
+          <w:tcPr>
+            <w:tcW w:w="1007" w:type="dxa"/>
             <w:shd w:val="clear" w:color="auto" w:fill="FFFFFF" w:themeFill="background1"/>
           </w:tcPr>
           <w:p>
@@ -920,7 +1036,7 @@
         </w:tc>
         <w:tc>
           <w:tcPr>
-            <w:tcW w:w="1432" w:type="dxa"/>
+            <w:tcW w:w="2053" w:type="dxa"/>
             <w:shd w:val="clear" w:color="auto" w:fill="FFFFFF" w:themeFill="background1"/>
           </w:tcPr>
           <w:p>
@@ -943,7 +1059,7 @@
         </w:tc>
         <w:tc>
           <w:tcPr>
-            <w:tcW w:w="845" w:type="dxa"/>
+            <w:tcW w:w="866" w:type="dxa"/>
             <w:shd w:val="clear" w:color="auto" w:fill="FFFFFF" w:themeFill="background1"/>
           </w:tcPr>
           <w:p>
@@ -966,7 +1082,7 @@
         </w:tc>
         <w:tc>
           <w:tcPr>
-            <w:tcW w:w="2343" w:type="dxa"/>
+            <w:tcW w:w="2104" w:type="dxa"/>
             <w:shd w:val="clear" w:color="auto" w:fill="FFFFFF" w:themeFill="background1"/>
           </w:tcPr>
           <w:p>
@@ -997,8 +1113,8 @@
         </w:trPr>
         <w:tc>
           <w:tcPr>
-            <w:tcW w:w="990" w:type="dxa"/>
-            <w:shd w:val="clear" w:color="auto" w:fill="D9D9D9" w:themeFill="background1" w:themeFillShade="D9"/>
+            <w:tcW w:w="1121" w:type="dxa"/>
+            <w:shd w:val="clear" w:color="auto" w:fill="CCCCCC"/>
           </w:tcPr>
           <w:p>
             <w:pPr>
@@ -1024,8 +1140,8 @@
         </w:tc>
         <w:tc>
           <w:tcPr>
-            <w:tcW w:w="2846" w:type="dxa"/>
-            <w:shd w:val="clear" w:color="auto" w:fill="D9D9D9" w:themeFill="background1" w:themeFillShade="D9"/>
+            <w:tcW w:w="2204" w:type="dxa"/>
+            <w:shd w:val="clear" w:color="auto" w:fill="CCCCCC"/>
           </w:tcPr>
           <w:p>
             <w:pPr>
@@ -1036,6 +1152,7 @@
               </w:rPr>
             </w:pPr>
             <w:proofErr w:type="spellStart"/>
+            <w:proofErr w:type="gramStart"/>
             <w:r>
               <w:rPr>
                 <w:rFonts w:ascii="Arial" w:hAnsi="Arial" w:cs="Arial"/>
@@ -1051,14 +1168,23 @@
                 <w:sz w:val="22"/>
                 <w:szCs w:val="22"/>
               </w:rPr>
-              <w:t>()</w:t>
-            </w:r>
-          </w:p>
-        </w:tc>
-        <w:tc>
-          <w:tcPr>
-            <w:tcW w:w="894" w:type="dxa"/>
-            <w:shd w:val="clear" w:color="auto" w:fill="D9D9D9" w:themeFill="background1" w:themeFillShade="D9"/>
+              <w:t>(</w:t>
+            </w:r>
+            <w:proofErr w:type="gramEnd"/>
+            <w:r>
+              <w:rPr>
+                <w:rFonts w:ascii="Arial" w:hAnsi="Arial" w:cs="Arial"/>
+                <w:sz w:val="22"/>
+                <w:szCs w:val="22"/>
+              </w:rPr>
+              <w:t>)</w:t>
+            </w:r>
+          </w:p>
+        </w:tc>
+        <w:tc>
+          <w:tcPr>
+            <w:tcW w:w="1007" w:type="dxa"/>
+            <w:shd w:val="clear" w:color="auto" w:fill="CCCCCC"/>
           </w:tcPr>
           <w:p>
             <w:pPr>
@@ -1080,8 +1206,8 @@
         </w:tc>
         <w:tc>
           <w:tcPr>
-            <w:tcW w:w="1432" w:type="dxa"/>
-            <w:shd w:val="clear" w:color="auto" w:fill="D9D9D9" w:themeFill="background1" w:themeFillShade="D9"/>
+            <w:tcW w:w="2053" w:type="dxa"/>
+            <w:shd w:val="clear" w:color="auto" w:fill="CCCCCC"/>
           </w:tcPr>
           <w:p>
             <w:pPr>
@@ -1103,8 +1229,8 @@
         </w:tc>
         <w:tc>
           <w:tcPr>
-            <w:tcW w:w="845" w:type="dxa"/>
-            <w:shd w:val="clear" w:color="auto" w:fill="D9D9D9" w:themeFill="background1" w:themeFillShade="D9"/>
+            <w:tcW w:w="866" w:type="dxa"/>
+            <w:shd w:val="clear" w:color="auto" w:fill="CCCCCC"/>
           </w:tcPr>
           <w:p>
             <w:pPr>
@@ -1143,8 +1269,8 @@
         </w:tc>
         <w:tc>
           <w:tcPr>
-            <w:tcW w:w="2343" w:type="dxa"/>
-            <w:shd w:val="clear" w:color="auto" w:fill="D9D9D9" w:themeFill="background1" w:themeFillShade="D9"/>
+            <w:tcW w:w="2104" w:type="dxa"/>
+            <w:shd w:val="clear" w:color="auto" w:fill="CCCCCC"/>
           </w:tcPr>
           <w:p>
             <w:pPr>
@@ -1174,7 +1300,7 @@
         </w:trPr>
         <w:tc>
           <w:tcPr>
-            <w:tcW w:w="990" w:type="dxa"/>
+            <w:tcW w:w="1121" w:type="dxa"/>
             <w:shd w:val="clear" w:color="auto" w:fill="FFFFFF" w:themeFill="background1"/>
           </w:tcPr>
           <w:p>
@@ -1195,14 +1321,13 @@
                 <w:sz w:val="22"/>
                 <w:szCs w:val="22"/>
               </w:rPr>
-              <w:lastRenderedPageBreak/>
               <w:t>Profile Manager</w:t>
             </w:r>
           </w:p>
         </w:tc>
         <w:tc>
           <w:tcPr>
-            <w:tcW w:w="2846" w:type="dxa"/>
+            <w:tcW w:w="2204" w:type="dxa"/>
             <w:shd w:val="clear" w:color="auto" w:fill="FFFFFF" w:themeFill="background1"/>
           </w:tcPr>
           <w:p>
@@ -1214,6 +1339,7 @@
               </w:rPr>
             </w:pPr>
             <w:proofErr w:type="spellStart"/>
+            <w:proofErr w:type="gramStart"/>
             <w:r>
               <w:rPr>
                 <w:rFonts w:ascii="Arial" w:hAnsi="Arial" w:cs="Arial"/>
@@ -1229,13 +1355,22 @@
                 <w:sz w:val="22"/>
                 <w:szCs w:val="22"/>
               </w:rPr>
-              <w:t>()</w:t>
-            </w:r>
-          </w:p>
-        </w:tc>
-        <w:tc>
-          <w:tcPr>
-            <w:tcW w:w="894" w:type="dxa"/>
+              <w:t>(</w:t>
+            </w:r>
+            <w:proofErr w:type="gramEnd"/>
+            <w:r>
+              <w:rPr>
+                <w:rFonts w:ascii="Arial" w:hAnsi="Arial" w:cs="Arial"/>
+                <w:sz w:val="22"/>
+                <w:szCs w:val="22"/>
+              </w:rPr>
+              <w:t>)</w:t>
+            </w:r>
+          </w:p>
+        </w:tc>
+        <w:tc>
+          <w:tcPr>
+            <w:tcW w:w="1007" w:type="dxa"/>
             <w:shd w:val="clear" w:color="auto" w:fill="FFFFFF" w:themeFill="background1"/>
           </w:tcPr>
           <w:p>
@@ -1258,7 +1393,7 @@
         </w:tc>
         <w:tc>
           <w:tcPr>
-            <w:tcW w:w="1432" w:type="dxa"/>
+            <w:tcW w:w="2053" w:type="dxa"/>
             <w:shd w:val="clear" w:color="auto" w:fill="FFFFFF" w:themeFill="background1"/>
           </w:tcPr>
           <w:p>
@@ -1281,7 +1416,7 @@
         </w:tc>
         <w:tc>
           <w:tcPr>
-            <w:tcW w:w="845" w:type="dxa"/>
+            <w:tcW w:w="866" w:type="dxa"/>
             <w:shd w:val="clear" w:color="auto" w:fill="FFFFFF" w:themeFill="background1"/>
           </w:tcPr>
           <w:p>
@@ -1304,7 +1439,7 @@
         </w:tc>
         <w:tc>
           <w:tcPr>
-            <w:tcW w:w="2343" w:type="dxa"/>
+            <w:tcW w:w="2104" w:type="dxa"/>
             <w:shd w:val="clear" w:color="auto" w:fill="FFFFFF" w:themeFill="background1"/>
           </w:tcPr>
           <w:p>
@@ -1335,8 +1470,8 @@
         </w:trPr>
         <w:tc>
           <w:tcPr>
-            <w:tcW w:w="990" w:type="dxa"/>
-            <w:shd w:val="clear" w:color="auto" w:fill="D9D9D9" w:themeFill="background1" w:themeFillShade="D9"/>
+            <w:tcW w:w="1121" w:type="dxa"/>
+            <w:shd w:val="clear" w:color="auto" w:fill="CCCCCC"/>
           </w:tcPr>
           <w:p>
             <w:pPr>
@@ -1362,8 +1497,8 @@
         </w:tc>
         <w:tc>
           <w:tcPr>
-            <w:tcW w:w="2846" w:type="dxa"/>
-            <w:shd w:val="clear" w:color="auto" w:fill="D9D9D9" w:themeFill="background1" w:themeFillShade="D9"/>
+            <w:tcW w:w="2204" w:type="dxa"/>
+            <w:shd w:val="clear" w:color="auto" w:fill="CCCCCC"/>
           </w:tcPr>
           <w:p>
             <w:pPr>
@@ -1387,8 +1522,8 @@
         </w:tc>
         <w:tc>
           <w:tcPr>
-            <w:tcW w:w="894" w:type="dxa"/>
-            <w:shd w:val="clear" w:color="auto" w:fill="D9D9D9" w:themeFill="background1" w:themeFillShade="D9"/>
+            <w:tcW w:w="1007" w:type="dxa"/>
+            <w:shd w:val="clear" w:color="auto" w:fill="CCCCCC"/>
           </w:tcPr>
           <w:p>
             <w:pPr>
@@ -1410,8 +1545,8 @@
         </w:tc>
         <w:tc>
           <w:tcPr>
-            <w:tcW w:w="1432" w:type="dxa"/>
-            <w:shd w:val="clear" w:color="auto" w:fill="D9D9D9" w:themeFill="background1" w:themeFillShade="D9"/>
+            <w:tcW w:w="2053" w:type="dxa"/>
+            <w:shd w:val="clear" w:color="auto" w:fill="CCCCCC"/>
           </w:tcPr>
           <w:p>
             <w:pPr>
@@ -1433,8 +1568,8 @@
         </w:tc>
         <w:tc>
           <w:tcPr>
-            <w:tcW w:w="845" w:type="dxa"/>
-            <w:shd w:val="clear" w:color="auto" w:fill="D9D9D9" w:themeFill="background1" w:themeFillShade="D9"/>
+            <w:tcW w:w="866" w:type="dxa"/>
+            <w:shd w:val="clear" w:color="auto" w:fill="CCCCCC"/>
           </w:tcPr>
           <w:p>
             <w:pPr>
@@ -1456,8 +1591,8 @@
         </w:tc>
         <w:tc>
           <w:tcPr>
-            <w:tcW w:w="2343" w:type="dxa"/>
-            <w:shd w:val="clear" w:color="auto" w:fill="D9D9D9" w:themeFill="background1" w:themeFillShade="D9"/>
+            <w:tcW w:w="2104" w:type="dxa"/>
+            <w:shd w:val="clear" w:color="auto" w:fill="CCCCCC"/>
           </w:tcPr>
           <w:p>
             <w:pPr>
@@ -1487,35 +1622,34 @@
         </w:trPr>
         <w:tc>
           <w:tcPr>
-            <w:tcW w:w="990" w:type="dxa"/>
-            <w:shd w:val="clear" w:color="auto" w:fill="FFFFFF" w:themeFill="background1"/>
-          </w:tcPr>
-          <w:p>
-            <w:pPr>
-              <w:rPr>
-                <w:rFonts w:ascii="Arial" w:hAnsi="Arial" w:cs="Arial"/>
-                <w:b/>
-                <w:bCs/>
-                <w:sz w:val="22"/>
-                <w:szCs w:val="22"/>
-              </w:rPr>
-            </w:pPr>
-            <w:r>
-              <w:rPr>
-                <w:rFonts w:ascii="Arial" w:hAnsi="Arial" w:cs="Arial"/>
-                <w:b/>
-                <w:bCs/>
-                <w:sz w:val="22"/>
-                <w:szCs w:val="22"/>
-              </w:rPr>
+            <w:tcW w:w="1121" w:type="dxa"/>
+          </w:tcPr>
+          <w:p>
+            <w:pPr>
+              <w:rPr>
+                <w:rFonts w:ascii="Arial" w:hAnsi="Arial" w:cs="Arial"/>
+                <w:b/>
+                <w:bCs/>
+                <w:sz w:val="22"/>
+                <w:szCs w:val="22"/>
+              </w:rPr>
+            </w:pPr>
+            <w:r>
+              <w:rPr>
+                <w:rFonts w:ascii="Arial" w:hAnsi="Arial" w:cs="Arial"/>
+                <w:b/>
+                <w:bCs/>
+                <w:sz w:val="22"/>
+                <w:szCs w:val="22"/>
+              </w:rPr>
+              <w:lastRenderedPageBreak/>
               <w:t>Profile Manager</w:t>
             </w:r>
           </w:p>
         </w:tc>
         <w:tc>
           <w:tcPr>
-            <w:tcW w:w="2846" w:type="dxa"/>
-            <w:shd w:val="clear" w:color="auto" w:fill="FFFFFF" w:themeFill="background1"/>
+            <w:tcW w:w="2204" w:type="dxa"/>
           </w:tcPr>
           <w:p>
             <w:pPr>
@@ -1539,8 +1673,7 @@
         </w:tc>
         <w:tc>
           <w:tcPr>
-            <w:tcW w:w="894" w:type="dxa"/>
-            <w:shd w:val="clear" w:color="auto" w:fill="FFFFFF" w:themeFill="background1"/>
+            <w:tcW w:w="1007" w:type="dxa"/>
           </w:tcPr>
           <w:p>
             <w:pPr>
@@ -1562,8 +1695,7 @@
         </w:tc>
         <w:tc>
           <w:tcPr>
-            <w:tcW w:w="1432" w:type="dxa"/>
-            <w:shd w:val="clear" w:color="auto" w:fill="FFFFFF" w:themeFill="background1"/>
+            <w:tcW w:w="2053" w:type="dxa"/>
           </w:tcPr>
           <w:p>
             <w:pPr>
@@ -1585,8 +1717,7 @@
         </w:tc>
         <w:tc>
           <w:tcPr>
-            <w:tcW w:w="845" w:type="dxa"/>
-            <w:shd w:val="clear" w:color="auto" w:fill="FFFFFF" w:themeFill="background1"/>
+            <w:tcW w:w="866" w:type="dxa"/>
           </w:tcPr>
           <w:p>
             <w:pPr>
@@ -1608,8 +1739,7 @@
         </w:tc>
         <w:tc>
           <w:tcPr>
-            <w:tcW w:w="2343" w:type="dxa"/>
-            <w:shd w:val="clear" w:color="auto" w:fill="FFFFFF" w:themeFill="background1"/>
+            <w:tcW w:w="2104" w:type="dxa"/>
           </w:tcPr>
           <w:p>
             <w:pPr>
@@ -1639,8 +1769,8 @@
         </w:trPr>
         <w:tc>
           <w:tcPr>
-            <w:tcW w:w="990" w:type="dxa"/>
-            <w:shd w:val="clear" w:color="auto" w:fill="D9D9D9" w:themeFill="background1" w:themeFillShade="D9"/>
+            <w:tcW w:w="1121" w:type="dxa"/>
+            <w:shd w:val="clear" w:color="auto" w:fill="CCCCCC"/>
           </w:tcPr>
           <w:p>
             <w:pPr>
@@ -1666,8 +1796,8 @@
         </w:tc>
         <w:tc>
           <w:tcPr>
-            <w:tcW w:w="2846" w:type="dxa"/>
-            <w:shd w:val="clear" w:color="auto" w:fill="D9D9D9" w:themeFill="background1" w:themeFillShade="D9"/>
+            <w:tcW w:w="2204" w:type="dxa"/>
+            <w:shd w:val="clear" w:color="auto" w:fill="CCCCCC"/>
           </w:tcPr>
           <w:p>
             <w:pPr>
@@ -1689,8 +1819,8 @@
         </w:tc>
         <w:tc>
           <w:tcPr>
-            <w:tcW w:w="894" w:type="dxa"/>
-            <w:shd w:val="clear" w:color="auto" w:fill="D9D9D9" w:themeFill="background1" w:themeFillShade="D9"/>
+            <w:tcW w:w="1007" w:type="dxa"/>
+            <w:shd w:val="clear" w:color="auto" w:fill="CCCCCC"/>
           </w:tcPr>
           <w:p>
             <w:pPr>
@@ -1712,8 +1842,8 @@
         </w:tc>
         <w:tc>
           <w:tcPr>
-            <w:tcW w:w="1432" w:type="dxa"/>
-            <w:shd w:val="clear" w:color="auto" w:fill="D9D9D9" w:themeFill="background1" w:themeFillShade="D9"/>
+            <w:tcW w:w="2053" w:type="dxa"/>
+            <w:shd w:val="clear" w:color="auto" w:fill="CCCCCC"/>
           </w:tcPr>
           <w:p>
             <w:pPr>
@@ -1735,8 +1865,8 @@
         </w:tc>
         <w:tc>
           <w:tcPr>
-            <w:tcW w:w="845" w:type="dxa"/>
-            <w:shd w:val="clear" w:color="auto" w:fill="D9D9D9" w:themeFill="background1" w:themeFillShade="D9"/>
+            <w:tcW w:w="866" w:type="dxa"/>
+            <w:shd w:val="clear" w:color="auto" w:fill="CCCCCC"/>
           </w:tcPr>
           <w:p>
             <w:pPr>
@@ -1758,8 +1888,8 @@
         </w:tc>
         <w:tc>
           <w:tcPr>
-            <w:tcW w:w="2343" w:type="dxa"/>
-            <w:shd w:val="clear" w:color="auto" w:fill="D9D9D9" w:themeFill="background1" w:themeFillShade="D9"/>
+            <w:tcW w:w="2104" w:type="dxa"/>
+            <w:shd w:val="clear" w:color="auto" w:fill="CCCCCC"/>
           </w:tcPr>
           <w:p>
             <w:pPr>
@@ -1789,8 +1919,7 @@
         </w:trPr>
         <w:tc>
           <w:tcPr>
-            <w:tcW w:w="990" w:type="dxa"/>
-            <w:shd w:val="clear" w:color="auto" w:fill="FFFFFF" w:themeFill="background1"/>
+            <w:tcW w:w="1121" w:type="dxa"/>
           </w:tcPr>
           <w:p>
             <w:pPr>
@@ -1816,8 +1945,7 @@
         </w:tc>
         <w:tc>
           <w:tcPr>
-            <w:tcW w:w="2846" w:type="dxa"/>
-            <w:shd w:val="clear" w:color="auto" w:fill="FFFFFF" w:themeFill="background1"/>
+            <w:tcW w:w="2204" w:type="dxa"/>
           </w:tcPr>
           <w:p>
             <w:pPr>
@@ -1841,8 +1969,7 @@
         </w:tc>
         <w:tc>
           <w:tcPr>
-            <w:tcW w:w="894" w:type="dxa"/>
-            <w:shd w:val="clear" w:color="auto" w:fill="FFFFFF" w:themeFill="background1"/>
+            <w:tcW w:w="1007" w:type="dxa"/>
           </w:tcPr>
           <w:p>
             <w:pPr>
@@ -1864,8 +1991,7 @@
         </w:tc>
         <w:tc>
           <w:tcPr>
-            <w:tcW w:w="1432" w:type="dxa"/>
-            <w:shd w:val="clear" w:color="auto" w:fill="FFFFFF" w:themeFill="background1"/>
+            <w:tcW w:w="2053" w:type="dxa"/>
           </w:tcPr>
           <w:p>
             <w:pPr>
@@ -1887,8 +2013,7 @@
         </w:tc>
         <w:tc>
           <w:tcPr>
-            <w:tcW w:w="845" w:type="dxa"/>
-            <w:shd w:val="clear" w:color="auto" w:fill="FFFFFF" w:themeFill="background1"/>
+            <w:tcW w:w="866" w:type="dxa"/>
           </w:tcPr>
           <w:p>
             <w:pPr>
@@ -1910,8 +2035,7 @@
         </w:tc>
         <w:tc>
           <w:tcPr>
-            <w:tcW w:w="2343" w:type="dxa"/>
-            <w:shd w:val="clear" w:color="auto" w:fill="FFFFFF" w:themeFill="background1"/>
+            <w:tcW w:w="2104" w:type="dxa"/>
           </w:tcPr>
           <w:p>
             <w:pPr>
@@ -1941,8 +2065,8 @@
         </w:trPr>
         <w:tc>
           <w:tcPr>
-            <w:tcW w:w="990" w:type="dxa"/>
-            <w:shd w:val="clear" w:color="auto" w:fill="D9D9D9" w:themeFill="background1" w:themeFillShade="D9"/>
+            <w:tcW w:w="1121" w:type="dxa"/>
+            <w:shd w:val="clear" w:color="auto" w:fill="CCCCCC"/>
           </w:tcPr>
           <w:p>
             <w:pPr>
@@ -1968,8 +2092,8 @@
         </w:tc>
         <w:tc>
           <w:tcPr>
-            <w:tcW w:w="2846" w:type="dxa"/>
-            <w:shd w:val="clear" w:color="auto" w:fill="D9D9D9" w:themeFill="background1" w:themeFillShade="D9"/>
+            <w:tcW w:w="2204" w:type="dxa"/>
+            <w:shd w:val="clear" w:color="auto" w:fill="CCCCCC"/>
           </w:tcPr>
           <w:p>
             <w:pPr>
@@ -1993,8 +2117,8 @@
         </w:tc>
         <w:tc>
           <w:tcPr>
-            <w:tcW w:w="894" w:type="dxa"/>
-            <w:shd w:val="clear" w:color="auto" w:fill="D9D9D9" w:themeFill="background1" w:themeFillShade="D9"/>
+            <w:tcW w:w="1007" w:type="dxa"/>
+            <w:shd w:val="clear" w:color="auto" w:fill="CCCCCC"/>
           </w:tcPr>
           <w:p>
             <w:pPr>
@@ -2016,8 +2140,8 @@
         </w:tc>
         <w:tc>
           <w:tcPr>
-            <w:tcW w:w="1432" w:type="dxa"/>
-            <w:shd w:val="clear" w:color="auto" w:fill="D9D9D9" w:themeFill="background1" w:themeFillShade="D9"/>
+            <w:tcW w:w="2053" w:type="dxa"/>
+            <w:shd w:val="clear" w:color="auto" w:fill="CCCCCC"/>
           </w:tcPr>
           <w:p>
             <w:pPr>
@@ -2039,8 +2163,8 @@
         </w:tc>
         <w:tc>
           <w:tcPr>
-            <w:tcW w:w="845" w:type="dxa"/>
-            <w:shd w:val="clear" w:color="auto" w:fill="D9D9D9" w:themeFill="background1" w:themeFillShade="D9"/>
+            <w:tcW w:w="866" w:type="dxa"/>
+            <w:shd w:val="clear" w:color="auto" w:fill="CCCCCC"/>
           </w:tcPr>
           <w:p>
             <w:pPr>
@@ -2062,8 +2186,8 @@
         </w:tc>
         <w:tc>
           <w:tcPr>
-            <w:tcW w:w="2343" w:type="dxa"/>
-            <w:shd w:val="clear" w:color="auto" w:fill="D9D9D9" w:themeFill="background1" w:themeFillShade="D9"/>
+            <w:tcW w:w="2104" w:type="dxa"/>
+            <w:shd w:val="clear" w:color="auto" w:fill="CCCCCC"/>
           </w:tcPr>
           <w:p>
             <w:pPr>
@@ -2131,36 +2255,33 @@
         </w:trPr>
         <w:tc>
           <w:tcPr>
-            <w:tcW w:w="990" w:type="dxa"/>
-            <w:shd w:val="clear" w:color="auto" w:fill="FFFFFF" w:themeFill="background1"/>
-          </w:tcPr>
-          <w:p>
-            <w:pPr>
-              <w:rPr>
-                <w:rFonts w:ascii="Arial" w:hAnsi="Arial" w:cs="Arial"/>
-                <w:b/>
-                <w:bCs/>
-                <w:sz w:val="22"/>
-                <w:szCs w:val="22"/>
-              </w:rPr>
-            </w:pPr>
-            <w:r>
-              <w:rPr>
-                <w:rFonts w:ascii="Arial" w:hAnsi="Arial" w:cs="Arial"/>
-                <w:b/>
-                <w:bCs/>
-                <w:sz w:val="22"/>
-                <w:szCs w:val="22"/>
-              </w:rPr>
-              <w:lastRenderedPageBreak/>
+            <w:tcW w:w="1121" w:type="dxa"/>
+          </w:tcPr>
+          <w:p>
+            <w:pPr>
+              <w:rPr>
+                <w:rFonts w:ascii="Arial" w:hAnsi="Arial" w:cs="Arial"/>
+                <w:b/>
+                <w:bCs/>
+                <w:sz w:val="22"/>
+                <w:szCs w:val="22"/>
+              </w:rPr>
+            </w:pPr>
+            <w:r>
+              <w:rPr>
+                <w:rFonts w:ascii="Arial" w:hAnsi="Arial" w:cs="Arial"/>
+                <w:b/>
+                <w:bCs/>
+                <w:sz w:val="22"/>
+                <w:szCs w:val="22"/>
+              </w:rPr>
               <w:t>Profile Manager</w:t>
             </w:r>
           </w:p>
         </w:tc>
         <w:tc>
           <w:tcPr>
-            <w:tcW w:w="2846" w:type="dxa"/>
-            <w:shd w:val="clear" w:color="auto" w:fill="FFFFFF" w:themeFill="background1"/>
+            <w:tcW w:w="2204" w:type="dxa"/>
           </w:tcPr>
           <w:p>
             <w:pPr>
@@ -2184,8 +2305,7 @@
         </w:tc>
         <w:tc>
           <w:tcPr>
-            <w:tcW w:w="894" w:type="dxa"/>
-            <w:shd w:val="clear" w:color="auto" w:fill="FFFFFF" w:themeFill="background1"/>
+            <w:tcW w:w="1007" w:type="dxa"/>
           </w:tcPr>
           <w:p>
             <w:pPr>
@@ -2207,8 +2327,7 @@
         </w:tc>
         <w:tc>
           <w:tcPr>
-            <w:tcW w:w="1432" w:type="dxa"/>
-            <w:shd w:val="clear" w:color="auto" w:fill="FFFFFF" w:themeFill="background1"/>
+            <w:tcW w:w="2053" w:type="dxa"/>
           </w:tcPr>
           <w:p>
             <w:pPr>
@@ -2230,8 +2349,7 @@
         </w:tc>
         <w:tc>
           <w:tcPr>
-            <w:tcW w:w="845" w:type="dxa"/>
-            <w:shd w:val="clear" w:color="auto" w:fill="FFFFFF" w:themeFill="background1"/>
+            <w:tcW w:w="866" w:type="dxa"/>
           </w:tcPr>
           <w:p>
             <w:pPr>
@@ -2253,8 +2371,7 @@
         </w:tc>
         <w:tc>
           <w:tcPr>
-            <w:tcW w:w="2343" w:type="dxa"/>
-            <w:shd w:val="clear" w:color="auto" w:fill="FFFFFF" w:themeFill="background1"/>
+            <w:tcW w:w="2104" w:type="dxa"/>
           </w:tcPr>
           <w:p>
             <w:pPr>
@@ -2302,8 +2419,8 @@
         </w:trPr>
         <w:tc>
           <w:tcPr>
-            <w:tcW w:w="990" w:type="dxa"/>
-            <w:shd w:val="clear" w:color="auto" w:fill="D9D9D9" w:themeFill="background1" w:themeFillShade="D9"/>
+            <w:tcW w:w="1121" w:type="dxa"/>
+            <w:shd w:val="clear" w:color="auto" w:fill="CCCCCC"/>
           </w:tcPr>
           <w:p>
             <w:pPr>
@@ -2329,8 +2446,8 @@
         </w:tc>
         <w:tc>
           <w:tcPr>
-            <w:tcW w:w="2846" w:type="dxa"/>
-            <w:shd w:val="clear" w:color="auto" w:fill="D9D9D9" w:themeFill="background1" w:themeFillShade="D9"/>
+            <w:tcW w:w="2204" w:type="dxa"/>
+            <w:shd w:val="clear" w:color="auto" w:fill="CCCCCC"/>
           </w:tcPr>
           <w:p>
             <w:pPr>
@@ -2354,8 +2471,8 @@
         </w:tc>
         <w:tc>
           <w:tcPr>
-            <w:tcW w:w="894" w:type="dxa"/>
-            <w:shd w:val="clear" w:color="auto" w:fill="D9D9D9" w:themeFill="background1" w:themeFillShade="D9"/>
+            <w:tcW w:w="1007" w:type="dxa"/>
+            <w:shd w:val="clear" w:color="auto" w:fill="CCCCCC"/>
           </w:tcPr>
           <w:p>
             <w:pPr>
@@ -2377,8 +2494,8 @@
         </w:tc>
         <w:tc>
           <w:tcPr>
-            <w:tcW w:w="1432" w:type="dxa"/>
-            <w:shd w:val="clear" w:color="auto" w:fill="D9D9D9" w:themeFill="background1" w:themeFillShade="D9"/>
+            <w:tcW w:w="2053" w:type="dxa"/>
+            <w:shd w:val="clear" w:color="auto" w:fill="CCCCCC"/>
           </w:tcPr>
           <w:p>
             <w:pPr>
@@ -2418,8 +2535,8 @@
         </w:tc>
         <w:tc>
           <w:tcPr>
-            <w:tcW w:w="845" w:type="dxa"/>
-            <w:shd w:val="clear" w:color="auto" w:fill="D9D9D9" w:themeFill="background1" w:themeFillShade="D9"/>
+            <w:tcW w:w="866" w:type="dxa"/>
+            <w:shd w:val="clear" w:color="auto" w:fill="CCCCCC"/>
           </w:tcPr>
           <w:p>
             <w:pPr>
@@ -2441,8 +2558,8 @@
         </w:tc>
         <w:tc>
           <w:tcPr>
-            <w:tcW w:w="2343" w:type="dxa"/>
-            <w:shd w:val="clear" w:color="auto" w:fill="D9D9D9" w:themeFill="background1" w:themeFillShade="D9"/>
+            <w:tcW w:w="2104" w:type="dxa"/>
+            <w:shd w:val="clear" w:color="auto" w:fill="CCCCCC"/>
           </w:tcPr>
           <w:p>
             <w:pPr>
@@ -2472,8 +2589,7 @@
         </w:trPr>
         <w:tc>
           <w:tcPr>
-            <w:tcW w:w="990" w:type="dxa"/>
-            <w:shd w:val="clear" w:color="auto" w:fill="FFFFFF" w:themeFill="background1"/>
+            <w:tcW w:w="1121" w:type="dxa"/>
           </w:tcPr>
           <w:p>
             <w:pPr>
@@ -2499,8 +2615,7 @@
         </w:tc>
         <w:tc>
           <w:tcPr>
-            <w:tcW w:w="2846" w:type="dxa"/>
-            <w:shd w:val="clear" w:color="auto" w:fill="FFFFFF" w:themeFill="background1"/>
+            <w:tcW w:w="2204" w:type="dxa"/>
           </w:tcPr>
           <w:p>
             <w:pPr>
@@ -2524,8 +2639,7 @@
         </w:tc>
         <w:tc>
           <w:tcPr>
-            <w:tcW w:w="894" w:type="dxa"/>
-            <w:shd w:val="clear" w:color="auto" w:fill="FFFFFF" w:themeFill="background1"/>
+            <w:tcW w:w="1007" w:type="dxa"/>
           </w:tcPr>
           <w:p>
             <w:pPr>
@@ -2547,8 +2661,7 @@
         </w:tc>
         <w:tc>
           <w:tcPr>
-            <w:tcW w:w="1432" w:type="dxa"/>
-            <w:shd w:val="clear" w:color="auto" w:fill="FFFFFF" w:themeFill="background1"/>
+            <w:tcW w:w="2053" w:type="dxa"/>
           </w:tcPr>
           <w:p>
             <w:pPr>
@@ -2570,8 +2683,7 @@
         </w:tc>
         <w:tc>
           <w:tcPr>
-            <w:tcW w:w="845" w:type="dxa"/>
-            <w:shd w:val="clear" w:color="auto" w:fill="FFFFFF" w:themeFill="background1"/>
+            <w:tcW w:w="866" w:type="dxa"/>
           </w:tcPr>
           <w:p>
             <w:pPr>
@@ -2593,8 +2705,7 @@
         </w:tc>
         <w:tc>
           <w:tcPr>
-            <w:tcW w:w="2343" w:type="dxa"/>
-            <w:shd w:val="clear" w:color="auto" w:fill="FFFFFF" w:themeFill="background1"/>
+            <w:tcW w:w="2104" w:type="dxa"/>
           </w:tcPr>
           <w:p>
             <w:pPr>
@@ -2652,8 +2763,8 @@
         </w:trPr>
         <w:tc>
           <w:tcPr>
-            <w:tcW w:w="990" w:type="dxa"/>
-            <w:shd w:val="clear" w:color="auto" w:fill="D9D9D9" w:themeFill="background1" w:themeFillShade="D9"/>
+            <w:tcW w:w="1121" w:type="dxa"/>
+            <w:shd w:val="clear" w:color="auto" w:fill="CCCCCC"/>
           </w:tcPr>
           <w:p>
             <w:pPr>
@@ -2679,8 +2790,8 @@
         </w:tc>
         <w:tc>
           <w:tcPr>
-            <w:tcW w:w="2846" w:type="dxa"/>
-            <w:shd w:val="clear" w:color="auto" w:fill="D9D9D9" w:themeFill="background1" w:themeFillShade="D9"/>
+            <w:tcW w:w="2204" w:type="dxa"/>
+            <w:shd w:val="clear" w:color="auto" w:fill="CCCCCC"/>
           </w:tcPr>
           <w:p>
             <w:pPr>
@@ -2702,8 +2813,8 @@
         </w:tc>
         <w:tc>
           <w:tcPr>
-            <w:tcW w:w="894" w:type="dxa"/>
-            <w:shd w:val="clear" w:color="auto" w:fill="D9D9D9" w:themeFill="background1" w:themeFillShade="D9"/>
+            <w:tcW w:w="1007" w:type="dxa"/>
+            <w:shd w:val="clear" w:color="auto" w:fill="CCCCCC"/>
           </w:tcPr>
           <w:p>
             <w:pPr>
@@ -2725,8 +2836,8 @@
         </w:tc>
         <w:tc>
           <w:tcPr>
-            <w:tcW w:w="1432" w:type="dxa"/>
-            <w:shd w:val="clear" w:color="auto" w:fill="D9D9D9" w:themeFill="background1" w:themeFillShade="D9"/>
+            <w:tcW w:w="2053" w:type="dxa"/>
+            <w:shd w:val="clear" w:color="auto" w:fill="CCCCCC"/>
           </w:tcPr>
           <w:p>
             <w:pPr>
@@ -2748,8 +2859,8 @@
         </w:tc>
         <w:tc>
           <w:tcPr>
-            <w:tcW w:w="845" w:type="dxa"/>
-            <w:shd w:val="clear" w:color="auto" w:fill="D9D9D9" w:themeFill="background1" w:themeFillShade="D9"/>
+            <w:tcW w:w="866" w:type="dxa"/>
+            <w:shd w:val="clear" w:color="auto" w:fill="CCCCCC"/>
           </w:tcPr>
           <w:p>
             <w:pPr>
@@ -2771,8 +2882,8 @@
         </w:tc>
         <w:tc>
           <w:tcPr>
-            <w:tcW w:w="2343" w:type="dxa"/>
-            <w:shd w:val="clear" w:color="auto" w:fill="D9D9D9" w:themeFill="background1" w:themeFillShade="D9"/>
+            <w:tcW w:w="2104" w:type="dxa"/>
+            <w:shd w:val="clear" w:color="auto" w:fill="CCCCCC"/>
           </w:tcPr>
           <w:p>
             <w:pPr>
@@ -2820,35 +2931,36 @@
         </w:trPr>
         <w:tc>
           <w:tcPr>
-            <w:tcW w:w="990" w:type="dxa"/>
-            <w:shd w:val="clear" w:color="auto" w:fill="D9D9D9" w:themeFill="background1" w:themeFillShade="D9"/>
-          </w:tcPr>
-          <w:p>
-            <w:pPr>
-              <w:rPr>
-                <w:rFonts w:ascii="Arial" w:hAnsi="Arial" w:cs="Arial"/>
-                <w:b/>
-                <w:bCs/>
-                <w:sz w:val="22"/>
-                <w:szCs w:val="22"/>
-              </w:rPr>
-            </w:pPr>
-            <w:r>
-              <w:rPr>
-                <w:rFonts w:ascii="Arial" w:hAnsi="Arial" w:cs="Arial"/>
-                <w:b/>
-                <w:bCs/>
-                <w:sz w:val="22"/>
-                <w:szCs w:val="22"/>
-              </w:rPr>
+            <w:tcW w:w="1121" w:type="dxa"/>
+            <w:shd w:val="clear" w:color="auto" w:fill="CCCCCC"/>
+          </w:tcPr>
+          <w:p>
+            <w:pPr>
+              <w:rPr>
+                <w:rFonts w:ascii="Arial" w:hAnsi="Arial" w:cs="Arial"/>
+                <w:b/>
+                <w:bCs/>
+                <w:sz w:val="22"/>
+                <w:szCs w:val="22"/>
+              </w:rPr>
+            </w:pPr>
+            <w:r>
+              <w:rPr>
+                <w:rFonts w:ascii="Arial" w:hAnsi="Arial" w:cs="Arial"/>
+                <w:b/>
+                <w:bCs/>
+                <w:sz w:val="22"/>
+                <w:szCs w:val="22"/>
+              </w:rPr>
+              <w:lastRenderedPageBreak/>
               <w:t>Profile Manager</w:t>
             </w:r>
           </w:p>
         </w:tc>
         <w:tc>
           <w:tcPr>
-            <w:tcW w:w="2846" w:type="dxa"/>
-            <w:shd w:val="clear" w:color="auto" w:fill="D9D9D9" w:themeFill="background1" w:themeFillShade="D9"/>
+            <w:tcW w:w="2204" w:type="dxa"/>
+            <w:shd w:val="clear" w:color="auto" w:fill="CCCCCC"/>
           </w:tcPr>
           <w:p>
             <w:pPr>
@@ -2872,8 +2984,8 @@
         </w:tc>
         <w:tc>
           <w:tcPr>
-            <w:tcW w:w="894" w:type="dxa"/>
-            <w:shd w:val="clear" w:color="auto" w:fill="D9D9D9" w:themeFill="background1" w:themeFillShade="D9"/>
+            <w:tcW w:w="1007" w:type="dxa"/>
+            <w:shd w:val="clear" w:color="auto" w:fill="CCCCCC"/>
           </w:tcPr>
           <w:p>
             <w:pPr>
@@ -2895,8 +3007,8 @@
         </w:tc>
         <w:tc>
           <w:tcPr>
-            <w:tcW w:w="1432" w:type="dxa"/>
-            <w:shd w:val="clear" w:color="auto" w:fill="D9D9D9" w:themeFill="background1" w:themeFillShade="D9"/>
+            <w:tcW w:w="2053" w:type="dxa"/>
+            <w:shd w:val="clear" w:color="auto" w:fill="CCCCCC"/>
           </w:tcPr>
           <w:p>
             <w:pPr>
@@ -2918,8 +3030,8 @@
         </w:tc>
         <w:tc>
           <w:tcPr>
-            <w:tcW w:w="845" w:type="dxa"/>
-            <w:shd w:val="clear" w:color="auto" w:fill="D9D9D9" w:themeFill="background1" w:themeFillShade="D9"/>
+            <w:tcW w:w="866" w:type="dxa"/>
+            <w:shd w:val="clear" w:color="auto" w:fill="CCCCCC"/>
           </w:tcPr>
           <w:p>
             <w:pPr>
@@ -2941,8 +3053,8 @@
         </w:tc>
         <w:tc>
           <w:tcPr>
-            <w:tcW w:w="2343" w:type="dxa"/>
-            <w:shd w:val="clear" w:color="auto" w:fill="D9D9D9" w:themeFill="background1" w:themeFillShade="D9"/>
+            <w:tcW w:w="2104" w:type="dxa"/>
+            <w:shd w:val="clear" w:color="auto" w:fill="CCCCCC"/>
           </w:tcPr>
           <w:p>
             <w:pPr>
@@ -2990,36 +3102,33 @@
         </w:trPr>
         <w:tc>
           <w:tcPr>
-            <w:tcW w:w="990" w:type="dxa"/>
-            <w:shd w:val="clear" w:color="auto" w:fill="FFFFFF" w:themeFill="background1"/>
-          </w:tcPr>
-          <w:p>
-            <w:pPr>
-              <w:rPr>
-                <w:rFonts w:ascii="Arial" w:hAnsi="Arial" w:cs="Arial"/>
-                <w:b/>
-                <w:bCs/>
-                <w:sz w:val="22"/>
-                <w:szCs w:val="22"/>
-              </w:rPr>
-            </w:pPr>
-            <w:r>
-              <w:rPr>
-                <w:rFonts w:ascii="Arial" w:hAnsi="Arial" w:cs="Arial"/>
-                <w:b/>
-                <w:bCs/>
-                <w:sz w:val="22"/>
-                <w:szCs w:val="22"/>
-              </w:rPr>
-              <w:lastRenderedPageBreak/>
+            <w:tcW w:w="1121" w:type="dxa"/>
+          </w:tcPr>
+          <w:p>
+            <w:pPr>
+              <w:rPr>
+                <w:rFonts w:ascii="Arial" w:hAnsi="Arial" w:cs="Arial"/>
+                <w:b/>
+                <w:bCs/>
+                <w:sz w:val="22"/>
+                <w:szCs w:val="22"/>
+              </w:rPr>
+            </w:pPr>
+            <w:r>
+              <w:rPr>
+                <w:rFonts w:ascii="Arial" w:hAnsi="Arial" w:cs="Arial"/>
+                <w:b/>
+                <w:bCs/>
+                <w:sz w:val="22"/>
+                <w:szCs w:val="22"/>
+              </w:rPr>
               <w:t>Profile Manager</w:t>
             </w:r>
           </w:p>
         </w:tc>
         <w:tc>
           <w:tcPr>
-            <w:tcW w:w="2846" w:type="dxa"/>
-            <w:shd w:val="clear" w:color="auto" w:fill="FFFFFF" w:themeFill="background1"/>
+            <w:tcW w:w="2204" w:type="dxa"/>
           </w:tcPr>
           <w:p>
             <w:pPr>
@@ -3041,8 +3150,7 @@
         </w:tc>
         <w:tc>
           <w:tcPr>
-            <w:tcW w:w="894" w:type="dxa"/>
-            <w:shd w:val="clear" w:color="auto" w:fill="FFFFFF" w:themeFill="background1"/>
+            <w:tcW w:w="1007" w:type="dxa"/>
           </w:tcPr>
           <w:p>
             <w:pPr>
@@ -3064,8 +3172,7 @@
         </w:tc>
         <w:tc>
           <w:tcPr>
-            <w:tcW w:w="1432" w:type="dxa"/>
-            <w:shd w:val="clear" w:color="auto" w:fill="FFFFFF" w:themeFill="background1"/>
+            <w:tcW w:w="2053" w:type="dxa"/>
           </w:tcPr>
           <w:p>
             <w:pPr>
@@ -3087,8 +3194,7 @@
         </w:tc>
         <w:tc>
           <w:tcPr>
-            <w:tcW w:w="845" w:type="dxa"/>
-            <w:shd w:val="clear" w:color="auto" w:fill="FFFFFF" w:themeFill="background1"/>
+            <w:tcW w:w="866" w:type="dxa"/>
           </w:tcPr>
           <w:p>
             <w:pPr>
@@ -3110,8 +3216,7 @@
         </w:tc>
         <w:tc>
           <w:tcPr>
-            <w:tcW w:w="2343" w:type="dxa"/>
-            <w:shd w:val="clear" w:color="auto" w:fill="FFFFFF" w:themeFill="background1"/>
+            <w:tcW w:w="2104" w:type="dxa"/>
           </w:tcPr>
           <w:p>
             <w:pPr>
@@ -3141,8 +3246,8 @@
         </w:trPr>
         <w:tc>
           <w:tcPr>
-            <w:tcW w:w="990" w:type="dxa"/>
-            <w:shd w:val="clear" w:color="auto" w:fill="D9D9D9" w:themeFill="background1" w:themeFillShade="D9"/>
+            <w:tcW w:w="1121" w:type="dxa"/>
+            <w:shd w:val="clear" w:color="auto" w:fill="CCCCCC"/>
           </w:tcPr>
           <w:p>
             <w:pPr>
@@ -3168,8 +3273,8 @@
         </w:tc>
         <w:tc>
           <w:tcPr>
-            <w:tcW w:w="2846" w:type="dxa"/>
-            <w:shd w:val="clear" w:color="auto" w:fill="D9D9D9" w:themeFill="background1" w:themeFillShade="D9"/>
+            <w:tcW w:w="2204" w:type="dxa"/>
+            <w:shd w:val="clear" w:color="auto" w:fill="CCCCCC"/>
           </w:tcPr>
           <w:p>
             <w:pPr>
@@ -3193,8 +3298,8 @@
         </w:tc>
         <w:tc>
           <w:tcPr>
-            <w:tcW w:w="894" w:type="dxa"/>
-            <w:shd w:val="clear" w:color="auto" w:fill="D9D9D9" w:themeFill="background1" w:themeFillShade="D9"/>
+            <w:tcW w:w="1007" w:type="dxa"/>
+            <w:shd w:val="clear" w:color="auto" w:fill="CCCCCC"/>
           </w:tcPr>
           <w:p>
             <w:pPr>
@@ -3216,8 +3321,8 @@
         </w:tc>
         <w:tc>
           <w:tcPr>
-            <w:tcW w:w="1432" w:type="dxa"/>
-            <w:shd w:val="clear" w:color="auto" w:fill="D9D9D9" w:themeFill="background1" w:themeFillShade="D9"/>
+            <w:tcW w:w="2053" w:type="dxa"/>
+            <w:shd w:val="clear" w:color="auto" w:fill="CCCCCC"/>
           </w:tcPr>
           <w:p>
             <w:pPr>
@@ -3239,8 +3344,8 @@
         </w:tc>
         <w:tc>
           <w:tcPr>
-            <w:tcW w:w="845" w:type="dxa"/>
-            <w:shd w:val="clear" w:color="auto" w:fill="D9D9D9" w:themeFill="background1" w:themeFillShade="D9"/>
+            <w:tcW w:w="866" w:type="dxa"/>
+            <w:shd w:val="clear" w:color="auto" w:fill="CCCCCC"/>
           </w:tcPr>
           <w:p>
             <w:pPr>
@@ -3262,8 +3367,8 @@
         </w:tc>
         <w:tc>
           <w:tcPr>
-            <w:tcW w:w="2343" w:type="dxa"/>
-            <w:shd w:val="clear" w:color="auto" w:fill="D9D9D9" w:themeFill="background1" w:themeFillShade="D9"/>
+            <w:tcW w:w="2104" w:type="dxa"/>
+            <w:shd w:val="clear" w:color="auto" w:fill="CCCCCC"/>
           </w:tcPr>
           <w:p>
             <w:pPr>
@@ -3311,8 +3416,7 @@
         </w:trPr>
         <w:tc>
           <w:tcPr>
-            <w:tcW w:w="990" w:type="dxa"/>
-            <w:shd w:val="clear" w:color="auto" w:fill="FFFFFF" w:themeFill="background1"/>
+            <w:tcW w:w="1121" w:type="dxa"/>
           </w:tcPr>
           <w:p>
             <w:pPr>
@@ -3338,8 +3442,7 @@
         </w:tc>
         <w:tc>
           <w:tcPr>
-            <w:tcW w:w="2846" w:type="dxa"/>
-            <w:shd w:val="clear" w:color="auto" w:fill="FFFFFF" w:themeFill="background1"/>
+            <w:tcW w:w="2204" w:type="dxa"/>
           </w:tcPr>
           <w:p>
             <w:pPr>
@@ -3363,8 +3466,7 @@
         </w:tc>
         <w:tc>
           <w:tcPr>
-            <w:tcW w:w="894" w:type="dxa"/>
-            <w:shd w:val="clear" w:color="auto" w:fill="FFFFFF" w:themeFill="background1"/>
+            <w:tcW w:w="1007" w:type="dxa"/>
           </w:tcPr>
           <w:p>
             <w:pPr>
@@ -3386,8 +3488,7 @@
         </w:tc>
         <w:tc>
           <w:tcPr>
-            <w:tcW w:w="1432" w:type="dxa"/>
-            <w:shd w:val="clear" w:color="auto" w:fill="FFFFFF" w:themeFill="background1"/>
+            <w:tcW w:w="2053" w:type="dxa"/>
           </w:tcPr>
           <w:p>
             <w:pPr>
@@ -3409,8 +3510,7 @@
         </w:tc>
         <w:tc>
           <w:tcPr>
-            <w:tcW w:w="845" w:type="dxa"/>
-            <w:shd w:val="clear" w:color="auto" w:fill="FFFFFF" w:themeFill="background1"/>
+            <w:tcW w:w="866" w:type="dxa"/>
           </w:tcPr>
           <w:p>
             <w:pPr>
@@ -3432,8 +3532,7 @@
         </w:tc>
         <w:tc>
           <w:tcPr>
-            <w:tcW w:w="2343" w:type="dxa"/>
-            <w:shd w:val="clear" w:color="auto" w:fill="FFFFFF" w:themeFill="background1"/>
+            <w:tcW w:w="2104" w:type="dxa"/>
           </w:tcPr>
           <w:p>
             <w:pPr>
@@ -3481,8 +3580,8 @@
         </w:trPr>
         <w:tc>
           <w:tcPr>
-            <w:tcW w:w="990" w:type="dxa"/>
-            <w:shd w:val="clear" w:color="auto" w:fill="D9D9D9" w:themeFill="background1" w:themeFillShade="D9"/>
+            <w:tcW w:w="1121" w:type="dxa"/>
+            <w:shd w:val="clear" w:color="auto" w:fill="CCCCCC"/>
           </w:tcPr>
           <w:p>
             <w:pPr>
@@ -3508,8 +3607,8 @@
         </w:tc>
         <w:tc>
           <w:tcPr>
-            <w:tcW w:w="2846" w:type="dxa"/>
-            <w:shd w:val="clear" w:color="auto" w:fill="D9D9D9" w:themeFill="background1" w:themeFillShade="D9"/>
+            <w:tcW w:w="2204" w:type="dxa"/>
+            <w:shd w:val="clear" w:color="auto" w:fill="CCCCCC"/>
           </w:tcPr>
           <w:p>
             <w:pPr>
@@ -3533,8 +3632,8 @@
         </w:tc>
         <w:tc>
           <w:tcPr>
-            <w:tcW w:w="894" w:type="dxa"/>
-            <w:shd w:val="clear" w:color="auto" w:fill="D9D9D9" w:themeFill="background1" w:themeFillShade="D9"/>
+            <w:tcW w:w="1007" w:type="dxa"/>
+            <w:shd w:val="clear" w:color="auto" w:fill="CCCCCC"/>
           </w:tcPr>
           <w:p>
             <w:pPr>
@@ -3556,8 +3655,8 @@
         </w:tc>
         <w:tc>
           <w:tcPr>
-            <w:tcW w:w="1432" w:type="dxa"/>
-            <w:shd w:val="clear" w:color="auto" w:fill="D9D9D9" w:themeFill="background1" w:themeFillShade="D9"/>
+            <w:tcW w:w="2053" w:type="dxa"/>
+            <w:shd w:val="clear" w:color="auto" w:fill="CCCCCC"/>
           </w:tcPr>
           <w:p>
             <w:pPr>
@@ -3579,8 +3678,8 @@
         </w:tc>
         <w:tc>
           <w:tcPr>
-            <w:tcW w:w="845" w:type="dxa"/>
-            <w:shd w:val="clear" w:color="auto" w:fill="D9D9D9" w:themeFill="background1" w:themeFillShade="D9"/>
+            <w:tcW w:w="866" w:type="dxa"/>
+            <w:shd w:val="clear" w:color="auto" w:fill="CCCCCC"/>
           </w:tcPr>
           <w:p>
             <w:pPr>
@@ -3602,8 +3701,8 @@
         </w:tc>
         <w:tc>
           <w:tcPr>
-            <w:tcW w:w="2343" w:type="dxa"/>
-            <w:shd w:val="clear" w:color="auto" w:fill="D9D9D9" w:themeFill="background1" w:themeFillShade="D9"/>
+            <w:tcW w:w="2104" w:type="dxa"/>
+            <w:shd w:val="clear" w:color="auto" w:fill="CCCCCC"/>
           </w:tcPr>
           <w:p>
             <w:pPr>
@@ -3662,8 +3761,7 @@
         </w:trPr>
         <w:tc>
           <w:tcPr>
-            <w:tcW w:w="990" w:type="dxa"/>
-            <w:shd w:val="clear" w:color="auto" w:fill="FFFFFF" w:themeFill="background1"/>
+            <w:tcW w:w="1121" w:type="dxa"/>
           </w:tcPr>
           <w:p>
             <w:pPr>
@@ -3689,8 +3787,7 @@
         </w:tc>
         <w:tc>
           <w:tcPr>
-            <w:tcW w:w="2846" w:type="dxa"/>
-            <w:shd w:val="clear" w:color="auto" w:fill="FFFFFF" w:themeFill="background1"/>
+            <w:tcW w:w="2204" w:type="dxa"/>
           </w:tcPr>
           <w:p>
             <w:pPr>
@@ -3714,8 +3811,7 @@
         </w:tc>
         <w:tc>
           <w:tcPr>
-            <w:tcW w:w="894" w:type="dxa"/>
-            <w:shd w:val="clear" w:color="auto" w:fill="FFFFFF" w:themeFill="background1"/>
+            <w:tcW w:w="1007" w:type="dxa"/>
           </w:tcPr>
           <w:p>
             <w:pPr>
@@ -3737,8 +3833,7 @@
         </w:tc>
         <w:tc>
           <w:tcPr>
-            <w:tcW w:w="1432" w:type="dxa"/>
-            <w:shd w:val="clear" w:color="auto" w:fill="FFFFFF" w:themeFill="background1"/>
+            <w:tcW w:w="2053" w:type="dxa"/>
           </w:tcPr>
           <w:p>
             <w:pPr>
@@ -3760,8 +3855,7 @@
         </w:tc>
         <w:tc>
           <w:tcPr>
-            <w:tcW w:w="845" w:type="dxa"/>
-            <w:shd w:val="clear" w:color="auto" w:fill="FFFFFF" w:themeFill="background1"/>
+            <w:tcW w:w="866" w:type="dxa"/>
           </w:tcPr>
           <w:p>
             <w:pPr>
@@ -3783,8 +3877,7 @@
         </w:tc>
         <w:tc>
           <w:tcPr>
-            <w:tcW w:w="2343" w:type="dxa"/>
-            <w:shd w:val="clear" w:color="auto" w:fill="FFFFFF" w:themeFill="background1"/>
+            <w:tcW w:w="2104" w:type="dxa"/>
           </w:tcPr>
           <w:p>
             <w:pPr>
@@ -3814,8 +3907,8 @@
         </w:trPr>
         <w:tc>
           <w:tcPr>
-            <w:tcW w:w="990" w:type="dxa"/>
-            <w:shd w:val="clear" w:color="auto" w:fill="D9D9D9" w:themeFill="background1" w:themeFillShade="D9"/>
+            <w:tcW w:w="1121" w:type="dxa"/>
+            <w:shd w:val="clear" w:color="auto" w:fill="CCCCCC"/>
           </w:tcPr>
           <w:p>
             <w:pPr>
@@ -3841,8 +3934,8 @@
         </w:tc>
         <w:tc>
           <w:tcPr>
-            <w:tcW w:w="2846" w:type="dxa"/>
-            <w:shd w:val="clear" w:color="auto" w:fill="D9D9D9" w:themeFill="background1" w:themeFillShade="D9"/>
+            <w:tcW w:w="2204" w:type="dxa"/>
+            <w:shd w:val="clear" w:color="auto" w:fill="CCCCCC"/>
           </w:tcPr>
           <w:p>
             <w:pPr>
@@ -3866,8 +3959,8 @@
         </w:tc>
         <w:tc>
           <w:tcPr>
-            <w:tcW w:w="894" w:type="dxa"/>
-            <w:shd w:val="clear" w:color="auto" w:fill="D9D9D9" w:themeFill="background1" w:themeFillShade="D9"/>
+            <w:tcW w:w="1007" w:type="dxa"/>
+            <w:shd w:val="clear" w:color="auto" w:fill="CCCCCC"/>
           </w:tcPr>
           <w:p>
             <w:pPr>
@@ -3889,8 +3982,8 @@
         </w:tc>
         <w:tc>
           <w:tcPr>
-            <w:tcW w:w="1432" w:type="dxa"/>
-            <w:shd w:val="clear" w:color="auto" w:fill="D9D9D9" w:themeFill="background1" w:themeFillShade="D9"/>
+            <w:tcW w:w="2053" w:type="dxa"/>
+            <w:shd w:val="clear" w:color="auto" w:fill="CCCCCC"/>
           </w:tcPr>
           <w:p>
             <w:pPr>
@@ -3912,8 +4005,8 @@
         </w:tc>
         <w:tc>
           <w:tcPr>
-            <w:tcW w:w="845" w:type="dxa"/>
-            <w:shd w:val="clear" w:color="auto" w:fill="D9D9D9" w:themeFill="background1" w:themeFillShade="D9"/>
+            <w:tcW w:w="866" w:type="dxa"/>
+            <w:shd w:val="clear" w:color="auto" w:fill="CCCCCC"/>
           </w:tcPr>
           <w:p>
             <w:pPr>
@@ -3935,8 +4028,8 @@
         </w:tc>
         <w:tc>
           <w:tcPr>
-            <w:tcW w:w="2343" w:type="dxa"/>
-            <w:shd w:val="clear" w:color="auto" w:fill="D9D9D9" w:themeFill="background1" w:themeFillShade="D9"/>
+            <w:tcW w:w="2104" w:type="dxa"/>
+            <w:shd w:val="clear" w:color="auto" w:fill="CCCCCC"/>
           </w:tcPr>
           <w:p>
             <w:pPr>
@@ -3966,8 +4059,7 @@
         </w:trPr>
         <w:tc>
           <w:tcPr>
-            <w:tcW w:w="990" w:type="dxa"/>
-            <w:shd w:val="clear" w:color="auto" w:fill="FFFFFF" w:themeFill="background1"/>
+            <w:tcW w:w="1121" w:type="dxa"/>
           </w:tcPr>
           <w:p>
             <w:pPr>
@@ -3993,8 +4085,7 @@
         </w:tc>
         <w:tc>
           <w:tcPr>
-            <w:tcW w:w="2846" w:type="dxa"/>
-            <w:shd w:val="clear" w:color="auto" w:fill="FFFFFF" w:themeFill="background1"/>
+            <w:tcW w:w="2204" w:type="dxa"/>
           </w:tcPr>
           <w:p>
             <w:pPr>
@@ -4018,8 +4109,7 @@
         </w:tc>
         <w:tc>
           <w:tcPr>
-            <w:tcW w:w="894" w:type="dxa"/>
-            <w:shd w:val="clear" w:color="auto" w:fill="FFFFFF" w:themeFill="background1"/>
+            <w:tcW w:w="1007" w:type="dxa"/>
           </w:tcPr>
           <w:p>
             <w:pPr>
@@ -4041,8 +4131,7 @@
         </w:tc>
         <w:tc>
           <w:tcPr>
-            <w:tcW w:w="1432" w:type="dxa"/>
-            <w:shd w:val="clear" w:color="auto" w:fill="FFFFFF" w:themeFill="background1"/>
+            <w:tcW w:w="2053" w:type="dxa"/>
           </w:tcPr>
           <w:p>
             <w:pPr>
@@ -4064,8 +4153,7 @@
         </w:tc>
         <w:tc>
           <w:tcPr>
-            <w:tcW w:w="845" w:type="dxa"/>
-            <w:shd w:val="clear" w:color="auto" w:fill="FFFFFF" w:themeFill="background1"/>
+            <w:tcW w:w="866" w:type="dxa"/>
           </w:tcPr>
           <w:p>
             <w:pPr>
@@ -4087,8 +4175,7 @@
         </w:tc>
         <w:tc>
           <w:tcPr>
-            <w:tcW w:w="2343" w:type="dxa"/>
-            <w:shd w:val="clear" w:color="auto" w:fill="FFFFFF" w:themeFill="background1"/>
+            <w:tcW w:w="2104" w:type="dxa"/>
           </w:tcPr>
           <w:p>
             <w:pPr>
@@ -5067,6 +5154,16 @@
       </w:tblBorders>
     </w:tblPr>
   </w:style>
+  <w:style w:type="paragraph" w:styleId="Revision">
+    <w:name w:val="Revision"/>
+    <w:hidden/>
+    <w:uiPriority w:val="99"/>
+    <w:semiHidden/>
+    <w:rsid w:val="00CC6FDE"/>
+    <w:pPr>
+      <w:spacing w:after="0" w:line="240" w:lineRule="auto"/>
+    </w:pPr>
+  </w:style>
 </w:styles>
 </file>
 

</xml_diff>